<commit_message>
Rebuild FMS SOPs — remove italic Why: label (template fix retrofit)
Reruns the 5 FMS build scripts against the already-fixed
sop_record_common.py so FMS's SOP body text drops the "Why:" label
in the same way PSQ/HIC/IMS already do. No content or source
changes — mechanical re-render only. Records regenerated alongside
since each chapter's build script rebuilds everything together.

Co-Authored-By: Claude Sonnet 5 <noreply@anthropic.com>
Claude-Session: https://claude.ai/code/session_016VFLsECWt4VArpBiaqgrgF
</commit_message>
<xml_diff>
--- a/policies/build/sop_record_masters/FMS/SOP_FMS.1.a_to_f_planned_facilities_utilities_environment.docx
+++ b/policies/build/sop_record_masters/FMS/SOP_FMS.1.a_to_f_planned_facilities_utilities_environment.docx
@@ -208,12 +208,6 @@
     </w:p>
     <w:p>
       <w:r>
-        <w:rPr>
-          <w:i/>
-        </w:rPr>
-        <w:t xml:space="preserve">Why: </w:t>
-      </w:r>
-      <w:r>
         <w:t>so everyone knows which building failure belongs here and which belongs to a different SOP -- that's what gets the right person responding fast, instead of a dry tap or a dark corridor being nobody's problem for an hour.</w:t>
       </w:r>
     </w:p>
@@ -231,12 +225,6 @@
       </w:r>
     </w:p>
     <w:p>
-      <w:r>
-        <w:rPr>
-          <w:i/>
-        </w:rPr>
-        <w:t xml:space="preserve">Why: </w:t>
-      </w:r>
       <w:r>
         <w:t>a dark essential circuit or a dry clinical tap left unowned stays broken. Naming exactly who holds drawings, who watches utilities and who owns the backup tests is what gets it fixed before a patient is affected, not after.</w:t>
       </w:r>
@@ -314,12 +302,6 @@
     </w:p>
     <w:p>
       <w:r>
-        <w:rPr>
-          <w:i/>
-        </w:rPr>
-        <w:t xml:space="preserve">Why: </w:t>
-      </w:r>
-      <w:r>
         <w:t>A corridor pressed into service as a ward, or a sluice used as a sterile store, puts patients in a space that was never built to keep them safe. Matching the building to what we actually treat is what prevents that.</w:t>
       </w:r>
     </w:p>
@@ -347,12 +329,6 @@
       </w:r>
     </w:p>
     <w:p>
-      <w:r>
-        <w:rPr>
-          <w:i/>
-        </w:rPr>
-        <w:t xml:space="preserve">Why: </w:t>
-      </w:r>
       <w:r>
         <w:t>If a fire crew or a contractor is working from a drawing that doesn't match what was actually built, they can open the wrong panel or miss a wall that's no longer there. Current drawings are what keep that from happening.</w:t>
       </w:r>
@@ -382,12 +358,6 @@
     </w:p>
     <w:p>
       <w:r>
-        <w:rPr>
-          <w:i/>
-        </w:rPr>
-        <w:t xml:space="preserve">Why: </w:t>
-      </w:r>
-      <w:r>
         <w:t>A first-time family that can't find the entrance, registration, toilets or an exit -- in a language they actually read -- is lost in a building when they're already stressed. A sign nobody can read is a sign that was never posted.</w:t>
       </w:r>
     </w:p>
@@ -410,12 +380,6 @@
       </w:r>
     </w:p>
     <w:p>
-      <w:r>
-        <w:rPr>
-          <w:i/>
-        </w:rPr>
-        <w:t xml:space="preserve">Why: </w:t>
-      </w:r>
       <w:r>
         <w:t>A roof tank that looks full on paper while the OT scrub sink is dry because a valve is shut, or a theatre going dark because a changeover never closed, is a patient-safety failure that happens at the exact moment someone needs water or power most -- often at 3am, not during the morning check.</w:t>
       </w:r>
@@ -450,12 +414,6 @@
     </w:p>
     <w:p>
       <w:r>
-        <w:rPr>
-          <w:i/>
-        </w:rPr>
-        <w:t xml:space="preserve">Why: </w:t>
-      </w:r>
-      <w:r>
         <w:t>A weekly no-load crank proves the starter motor works, not that the generator will carry theatre, ICU and emergency lighting together when it's actually needed. A sealed tanker contract nobody has called at night is not a backup -- it's a promise.</w:t>
       </w:r>
     </w:p>
@@ -488,12 +446,6 @@
       </w:r>
     </w:p>
     <w:p>
-      <w:r>
-        <w:rPr>
-          <w:i/>
-        </w:rPr>
-        <w:t xml:space="preserve">Why: </w:t>
-      </w:r>
       <w:r>
         <w:t>A filed electricity bill or a single LED retrofit offered as the whole programme doesn't actually reduce what this hospital consumes or throws away. A real initiative with a measured result is what makes this more than a poster on a wall.</w:t>
       </w:r>

</xml_diff>